<commit_message>
Add line-numbered code excerpts to Initial Analysis sections
Both the Claude Docs and their .docx exports now include short, line-numbered
code snippets from the original run_benchmark.py for each benchmark, pulled
directly from the source and tied to the two bottlenecks already described:
pyflate's find_next_symbol/move_to_front/RLE loop, and nbody's pow() call
and float-boxing/list-write loop in advance()/report_energy().

Co-Authored-By: Claude Sonnet 5 <noreply@anthropic.com>
</commit_message>
<xml_diff>
--- a/nbody/report_nbody.docx
+++ b/nbody/report_nbody.docx
@@ -115,6 +115,268 @@
         <w:t>Corroborating data: 2.32 instructions per cycle and a low 3.3% cache-miss rate (much better than pyflate's 7.0%) confirm the bottleneck here is not memory locality -- nbody's working set is tiny and stays cache-resident. The cost is the sheer number of interpreter-level operations and object allocations per unit of math performed, also reflected in about 86K page-fault and minor-fault samples in the software-event report.</w:t>
       </w:r>
     </w:p>
+    <w:p>
+      <w:r>
+        <w:rPr>
+          <w:rFonts w:ascii="Calibri" w:hAnsi="Calibri"/>
+          <w:b w:val="0"/>
+          <w:i w:val="0"/>
+          <w:sz w:val="20"/>
+        </w:rPr>
+        <w:t>nbody/original/run_benchmark.py, lines 80-93 -- advance()'s inner pair loop: the pow() call for bottleneck 1 (line 85) and the float arithmetic plus list writes for bottleneck 2 (lines 82-93):</w:t>
+      </w:r>
+    </w:p>
+    <w:tbl>
+      <w:tblPr>
+        <w:tblStyle w:val="TableGrid"/>
+        <w:tblW w:type="auto" w:w="0"/>
+        <w:tblLook w:firstColumn="1" w:firstRow="1" w:lastColumn="0" w:lastRow="0" w:noHBand="0" w:noVBand="1" w:val="04A0"/>
+      </w:tblPr>
+      <w:tblGrid>
+        <w:gridCol w:w="8640"/>
+      </w:tblGrid>
+      <w:tr>
+        <w:tc>
+          <w:tcPr>
+            <w:tcW w:type="dxa" w:w="8640"/>
+            <w:shd w:val="clear" w:color="auto" w:fill="F2F2F2"/>
+          </w:tcPr>
+          <w:p>
+            <w:r/>
+            <w:r>
+              <w:rPr>
+                <w:rFonts w:ascii="Consolas" w:hAnsi="Consolas"/>
+                <w:i w:val="0"/>
+                <w:sz w:val="18"/>
+              </w:rPr>
+              <w:t>80        for (([x1, y1, z1], v1, m1),</w:t>
+            </w:r>
+          </w:p>
+          <w:p>
+            <w:r>
+              <w:rPr>
+                <w:rFonts w:ascii="Consolas" w:hAnsi="Consolas"/>
+                <w:i w:val="0"/>
+                <w:sz w:val="18"/>
+              </w:rPr>
+              <w:t>81             ([x2, y2, z2], v2, m2)) in pairs:</w:t>
+            </w:r>
+          </w:p>
+          <w:p>
+            <w:r>
+              <w:rPr>
+                <w:rFonts w:ascii="Consolas" w:hAnsi="Consolas"/>
+                <w:i w:val="0"/>
+                <w:sz w:val="18"/>
+              </w:rPr>
+              <w:t>82            dx = x1 - x2</w:t>
+            </w:r>
+          </w:p>
+          <w:p>
+            <w:r>
+              <w:rPr>
+                <w:rFonts w:ascii="Consolas" w:hAnsi="Consolas"/>
+                <w:i w:val="0"/>
+                <w:sz w:val="18"/>
+              </w:rPr>
+              <w:t>83            dy = y1 - y2</w:t>
+            </w:r>
+          </w:p>
+          <w:p>
+            <w:r>
+              <w:rPr>
+                <w:rFonts w:ascii="Consolas" w:hAnsi="Consolas"/>
+                <w:i w:val="0"/>
+                <w:sz w:val="18"/>
+              </w:rPr>
+              <w:t>84            dz = z1 - z2</w:t>
+            </w:r>
+          </w:p>
+          <w:p>
+            <w:r>
+              <w:rPr>
+                <w:rFonts w:ascii="Consolas" w:hAnsi="Consolas"/>
+                <w:i w:val="0"/>
+                <w:sz w:val="18"/>
+              </w:rPr>
+              <w:t>85            mag = dt * ((dx * dx + dy * dy + dz * dz) ** (-1.5))</w:t>
+            </w:r>
+          </w:p>
+          <w:p>
+            <w:r>
+              <w:rPr>
+                <w:rFonts w:ascii="Consolas" w:hAnsi="Consolas"/>
+                <w:i w:val="0"/>
+                <w:sz w:val="18"/>
+              </w:rPr>
+              <w:t>86            b1m = m1 * mag</w:t>
+            </w:r>
+          </w:p>
+          <w:p>
+            <w:r>
+              <w:rPr>
+                <w:rFonts w:ascii="Consolas" w:hAnsi="Consolas"/>
+                <w:i w:val="0"/>
+                <w:sz w:val="18"/>
+              </w:rPr>
+              <w:t>87            b2m = m2 * mag</w:t>
+            </w:r>
+          </w:p>
+          <w:p>
+            <w:r>
+              <w:rPr>
+                <w:rFonts w:ascii="Consolas" w:hAnsi="Consolas"/>
+                <w:i w:val="0"/>
+                <w:sz w:val="18"/>
+              </w:rPr>
+              <w:t>88            v1[0] -= dx * b2m</w:t>
+            </w:r>
+          </w:p>
+          <w:p>
+            <w:r>
+              <w:rPr>
+                <w:rFonts w:ascii="Consolas" w:hAnsi="Consolas"/>
+                <w:i w:val="0"/>
+                <w:sz w:val="18"/>
+              </w:rPr>
+              <w:t>89            v1[1] -= dy * b2m</w:t>
+            </w:r>
+          </w:p>
+          <w:p>
+            <w:r>
+              <w:rPr>
+                <w:rFonts w:ascii="Consolas" w:hAnsi="Consolas"/>
+                <w:i w:val="0"/>
+                <w:sz w:val="18"/>
+              </w:rPr>
+              <w:t>90            v1[2] -= dz * b2m</w:t>
+            </w:r>
+          </w:p>
+          <w:p>
+            <w:r>
+              <w:rPr>
+                <w:rFonts w:ascii="Consolas" w:hAnsi="Consolas"/>
+                <w:i w:val="0"/>
+                <w:sz w:val="18"/>
+              </w:rPr>
+              <w:t>91            v2[0] += dx * b1m</w:t>
+            </w:r>
+          </w:p>
+          <w:p>
+            <w:r>
+              <w:rPr>
+                <w:rFonts w:ascii="Consolas" w:hAnsi="Consolas"/>
+                <w:i w:val="0"/>
+                <w:sz w:val="18"/>
+              </w:rPr>
+              <w:t>92            v2[1] += dy * b1m</w:t>
+            </w:r>
+          </w:p>
+          <w:p>
+            <w:r>
+              <w:rPr>
+                <w:rFonts w:ascii="Consolas" w:hAnsi="Consolas"/>
+                <w:i w:val="0"/>
+                <w:sz w:val="18"/>
+              </w:rPr>
+              <w:t>93            v2[2] += dz * b1m</w:t>
+            </w:r>
+          </w:p>
+        </w:tc>
+      </w:tr>
+    </w:tbl>
+    <w:p/>
+    <w:p>
+      <w:r>
+        <w:rPr>
+          <w:rFonts w:ascii="Calibri" w:hAnsi="Calibri"/>
+          <w:b w:val="0"/>
+          <w:i w:val="0"/>
+          <w:sz w:val="20"/>
+        </w:rPr>
+        <w:t>nbody/original/run_benchmark.py, lines 101-106 -- report_energy()'s matching pow() call:</w:t>
+      </w:r>
+    </w:p>
+    <w:tbl>
+      <w:tblPr>
+        <w:tblStyle w:val="TableGrid"/>
+        <w:tblW w:type="auto" w:w="0"/>
+        <w:tblLook w:firstColumn="1" w:firstRow="1" w:lastColumn="0" w:lastRow="0" w:noHBand="0" w:noVBand="1" w:val="04A0"/>
+      </w:tblPr>
+      <w:tblGrid>
+        <w:gridCol w:w="8640"/>
+      </w:tblGrid>
+      <w:tr>
+        <w:tc>
+          <w:tcPr>
+            <w:tcW w:type="dxa" w:w="8640"/>
+            <w:shd w:val="clear" w:color="auto" w:fill="F2F2F2"/>
+          </w:tcPr>
+          <w:p>
+            <w:r/>
+            <w:r>
+              <w:rPr>
+                <w:rFonts w:ascii="Consolas" w:hAnsi="Consolas"/>
+                <w:i w:val="0"/>
+                <w:sz w:val="18"/>
+              </w:rPr>
+              <w:t>101       for (((x1, y1, z1), v1, m1),</w:t>
+            </w:r>
+          </w:p>
+          <w:p>
+            <w:r>
+              <w:rPr>
+                <w:rFonts w:ascii="Consolas" w:hAnsi="Consolas"/>
+                <w:i w:val="0"/>
+                <w:sz w:val="18"/>
+              </w:rPr>
+              <w:t>102            ((x2, y2, z2), v2, m2)) in pairs:</w:t>
+            </w:r>
+          </w:p>
+          <w:p>
+            <w:r>
+              <w:rPr>
+                <w:rFonts w:ascii="Consolas" w:hAnsi="Consolas"/>
+                <w:i w:val="0"/>
+                <w:sz w:val="18"/>
+              </w:rPr>
+              <w:t>103           dx = x1 - x2</w:t>
+            </w:r>
+          </w:p>
+          <w:p>
+            <w:r>
+              <w:rPr>
+                <w:rFonts w:ascii="Consolas" w:hAnsi="Consolas"/>
+                <w:i w:val="0"/>
+                <w:sz w:val="18"/>
+              </w:rPr>
+              <w:t>104           dy = y1 - y2</w:t>
+            </w:r>
+          </w:p>
+          <w:p>
+            <w:r>
+              <w:rPr>
+                <w:rFonts w:ascii="Consolas" w:hAnsi="Consolas"/>
+                <w:i w:val="0"/>
+                <w:sz w:val="18"/>
+              </w:rPr>
+              <w:t>105           dz = z1 - z2</w:t>
+            </w:r>
+          </w:p>
+          <w:p>
+            <w:r>
+              <w:rPr>
+                <w:rFonts w:ascii="Consolas" w:hAnsi="Consolas"/>
+                <w:i w:val="0"/>
+                <w:sz w:val="18"/>
+              </w:rPr>
+              <w:t>106           e -= (m1 * m2) / ((dx * dx + dy * dy + dz * dz) ** 0.5)</w:t>
+            </w:r>
+          </w:p>
+        </w:tc>
+      </w:tr>
+    </w:tbl>
+    <w:p/>
     <w:p>
       <w:pPr>
         <w:jc w:val="center"/>

</xml_diff>

<commit_message>
Make docx tables black-and-white, compact code block line spacing
Tables switched from a colored/accented style to plain black-grid-on-white
(Table Grid, bold header text, no shading anywhere), for a more
professional/consistent look. Code block lines now use zero paragraph
spacing and single line spacing instead of inheriting Normal-style
spacing, so they read as tightly packed code rather than spaced-out prose.

Co-Authored-By: Claude Sonnet 5 <noreply@anthropic.com>
</commit_message>
<xml_diff>
--- a/nbody/report_nbody.docx
+++ b/nbody/report_nbody.docx
@@ -139,144 +139,199 @@
         <w:tc>
           <w:tcPr>
             <w:tcW w:type="dxa" w:w="8640"/>
-            <w:shd w:val="clear" w:color="auto" w:fill="F2F2F2"/>
           </w:tcPr>
           <w:p>
+            <w:pPr>
+              <w:spacing w:before="0" w:after="0" w:line="240" w:lineRule="auto"/>
+            </w:pPr>
             <w:r/>
             <w:r>
               <w:rPr>
                 <w:rFonts w:ascii="Consolas" w:hAnsi="Consolas"/>
                 <w:i w:val="0"/>
+                <w:color w:val="000000"/>
                 <w:sz w:val="18"/>
               </w:rPr>
               <w:t>80        for (([x1, y1, z1], v1, m1),</w:t>
             </w:r>
           </w:p>
           <w:p>
+            <w:pPr>
+              <w:spacing w:before="0" w:after="0" w:line="240" w:lineRule="auto"/>
+            </w:pPr>
             <w:r>
               <w:rPr>
                 <w:rFonts w:ascii="Consolas" w:hAnsi="Consolas"/>
                 <w:i w:val="0"/>
+                <w:color w:val="000000"/>
                 <w:sz w:val="18"/>
               </w:rPr>
               <w:t>81             ([x2, y2, z2], v2, m2)) in pairs:</w:t>
             </w:r>
           </w:p>
           <w:p>
+            <w:pPr>
+              <w:spacing w:before="0" w:after="0" w:line="240" w:lineRule="auto"/>
+            </w:pPr>
             <w:r>
               <w:rPr>
                 <w:rFonts w:ascii="Consolas" w:hAnsi="Consolas"/>
                 <w:i w:val="0"/>
+                <w:color w:val="000000"/>
                 <w:sz w:val="18"/>
               </w:rPr>
               <w:t>82            dx = x1 - x2</w:t>
             </w:r>
           </w:p>
           <w:p>
+            <w:pPr>
+              <w:spacing w:before="0" w:after="0" w:line="240" w:lineRule="auto"/>
+            </w:pPr>
             <w:r>
               <w:rPr>
                 <w:rFonts w:ascii="Consolas" w:hAnsi="Consolas"/>
                 <w:i w:val="0"/>
+                <w:color w:val="000000"/>
                 <w:sz w:val="18"/>
               </w:rPr>
               <w:t>83            dy = y1 - y2</w:t>
             </w:r>
           </w:p>
           <w:p>
+            <w:pPr>
+              <w:spacing w:before="0" w:after="0" w:line="240" w:lineRule="auto"/>
+            </w:pPr>
             <w:r>
               <w:rPr>
                 <w:rFonts w:ascii="Consolas" w:hAnsi="Consolas"/>
                 <w:i w:val="0"/>
+                <w:color w:val="000000"/>
                 <w:sz w:val="18"/>
               </w:rPr>
               <w:t>84            dz = z1 - z2</w:t>
             </w:r>
           </w:p>
           <w:p>
+            <w:pPr>
+              <w:spacing w:before="0" w:after="0" w:line="240" w:lineRule="auto"/>
+            </w:pPr>
             <w:r>
               <w:rPr>
                 <w:rFonts w:ascii="Consolas" w:hAnsi="Consolas"/>
                 <w:i w:val="0"/>
+                <w:color w:val="000000"/>
                 <w:sz w:val="18"/>
               </w:rPr>
               <w:t>85            mag = dt * ((dx * dx + dy * dy + dz * dz) ** (-1.5))</w:t>
             </w:r>
           </w:p>
           <w:p>
+            <w:pPr>
+              <w:spacing w:before="0" w:after="0" w:line="240" w:lineRule="auto"/>
+            </w:pPr>
             <w:r>
               <w:rPr>
                 <w:rFonts w:ascii="Consolas" w:hAnsi="Consolas"/>
                 <w:i w:val="0"/>
+                <w:color w:val="000000"/>
                 <w:sz w:val="18"/>
               </w:rPr>
               <w:t>86            b1m = m1 * mag</w:t>
             </w:r>
           </w:p>
           <w:p>
+            <w:pPr>
+              <w:spacing w:before="0" w:after="0" w:line="240" w:lineRule="auto"/>
+            </w:pPr>
             <w:r>
               <w:rPr>
                 <w:rFonts w:ascii="Consolas" w:hAnsi="Consolas"/>
                 <w:i w:val="0"/>
+                <w:color w:val="000000"/>
                 <w:sz w:val="18"/>
               </w:rPr>
               <w:t>87            b2m = m2 * mag</w:t>
             </w:r>
           </w:p>
           <w:p>
+            <w:pPr>
+              <w:spacing w:before="0" w:after="0" w:line="240" w:lineRule="auto"/>
+            </w:pPr>
             <w:r>
               <w:rPr>
                 <w:rFonts w:ascii="Consolas" w:hAnsi="Consolas"/>
                 <w:i w:val="0"/>
+                <w:color w:val="000000"/>
                 <w:sz w:val="18"/>
               </w:rPr>
               <w:t>88            v1[0] -= dx * b2m</w:t>
             </w:r>
           </w:p>
           <w:p>
+            <w:pPr>
+              <w:spacing w:before="0" w:after="0" w:line="240" w:lineRule="auto"/>
+            </w:pPr>
             <w:r>
               <w:rPr>
                 <w:rFonts w:ascii="Consolas" w:hAnsi="Consolas"/>
                 <w:i w:val="0"/>
+                <w:color w:val="000000"/>
                 <w:sz w:val="18"/>
               </w:rPr>
               <w:t>89            v1[1] -= dy * b2m</w:t>
             </w:r>
           </w:p>
           <w:p>
+            <w:pPr>
+              <w:spacing w:before="0" w:after="0" w:line="240" w:lineRule="auto"/>
+            </w:pPr>
             <w:r>
               <w:rPr>
                 <w:rFonts w:ascii="Consolas" w:hAnsi="Consolas"/>
                 <w:i w:val="0"/>
+                <w:color w:val="000000"/>
                 <w:sz w:val="18"/>
               </w:rPr>
               <w:t>90            v1[2] -= dz * b2m</w:t>
             </w:r>
           </w:p>
           <w:p>
+            <w:pPr>
+              <w:spacing w:before="0" w:after="0" w:line="240" w:lineRule="auto"/>
+            </w:pPr>
             <w:r>
               <w:rPr>
                 <w:rFonts w:ascii="Consolas" w:hAnsi="Consolas"/>
                 <w:i w:val="0"/>
+                <w:color w:val="000000"/>
                 <w:sz w:val="18"/>
               </w:rPr>
               <w:t>91            v2[0] += dx * b1m</w:t>
             </w:r>
           </w:p>
           <w:p>
+            <w:pPr>
+              <w:spacing w:before="0" w:after="0" w:line="240" w:lineRule="auto"/>
+            </w:pPr>
             <w:r>
               <w:rPr>
                 <w:rFonts w:ascii="Consolas" w:hAnsi="Consolas"/>
                 <w:i w:val="0"/>
+                <w:color w:val="000000"/>
                 <w:sz w:val="18"/>
               </w:rPr>
               <w:t>92            v2[1] += dy * b1m</w:t>
             </w:r>
           </w:p>
           <w:p>
+            <w:pPr>
+              <w:spacing w:before="0" w:after="0" w:line="240" w:lineRule="auto"/>
+            </w:pPr>
             <w:r>
               <w:rPr>
                 <w:rFonts w:ascii="Consolas" w:hAnsi="Consolas"/>
                 <w:i w:val="0"/>
+                <w:color w:val="000000"/>
                 <w:sz w:val="18"/>
               </w:rPr>
               <w:t>93            v2[2] += dz * b1m</w:t>
@@ -310,64 +365,87 @@
         <w:tc>
           <w:tcPr>
             <w:tcW w:type="dxa" w:w="8640"/>
-            <w:shd w:val="clear" w:color="auto" w:fill="F2F2F2"/>
           </w:tcPr>
           <w:p>
+            <w:pPr>
+              <w:spacing w:before="0" w:after="0" w:line="240" w:lineRule="auto"/>
+            </w:pPr>
             <w:r/>
             <w:r>
               <w:rPr>
                 <w:rFonts w:ascii="Consolas" w:hAnsi="Consolas"/>
                 <w:i w:val="0"/>
+                <w:color w:val="000000"/>
                 <w:sz w:val="18"/>
               </w:rPr>
               <w:t>101       for (((x1, y1, z1), v1, m1),</w:t>
             </w:r>
           </w:p>
           <w:p>
+            <w:pPr>
+              <w:spacing w:before="0" w:after="0" w:line="240" w:lineRule="auto"/>
+            </w:pPr>
             <w:r>
               <w:rPr>
                 <w:rFonts w:ascii="Consolas" w:hAnsi="Consolas"/>
                 <w:i w:val="0"/>
+                <w:color w:val="000000"/>
                 <w:sz w:val="18"/>
               </w:rPr>
               <w:t>102            ((x2, y2, z2), v2, m2)) in pairs:</w:t>
             </w:r>
           </w:p>
           <w:p>
+            <w:pPr>
+              <w:spacing w:before="0" w:after="0" w:line="240" w:lineRule="auto"/>
+            </w:pPr>
             <w:r>
               <w:rPr>
                 <w:rFonts w:ascii="Consolas" w:hAnsi="Consolas"/>
                 <w:i w:val="0"/>
+                <w:color w:val="000000"/>
                 <w:sz w:val="18"/>
               </w:rPr>
               <w:t>103           dx = x1 - x2</w:t>
             </w:r>
           </w:p>
           <w:p>
+            <w:pPr>
+              <w:spacing w:before="0" w:after="0" w:line="240" w:lineRule="auto"/>
+            </w:pPr>
             <w:r>
               <w:rPr>
                 <w:rFonts w:ascii="Consolas" w:hAnsi="Consolas"/>
                 <w:i w:val="0"/>
+                <w:color w:val="000000"/>
                 <w:sz w:val="18"/>
               </w:rPr>
               <w:t>104           dy = y1 - y2</w:t>
             </w:r>
           </w:p>
           <w:p>
+            <w:pPr>
+              <w:spacing w:before="0" w:after="0" w:line="240" w:lineRule="auto"/>
+            </w:pPr>
             <w:r>
               <w:rPr>
                 <w:rFonts w:ascii="Consolas" w:hAnsi="Consolas"/>
                 <w:i w:val="0"/>
+                <w:color w:val="000000"/>
                 <w:sz w:val="18"/>
               </w:rPr>
               <w:t>105           dz = z1 - z2</w:t>
             </w:r>
           </w:p>
           <w:p>
+            <w:pPr>
+              <w:spacing w:before="0" w:after="0" w:line="240" w:lineRule="auto"/>
+            </w:pPr>
             <w:r>
               <w:rPr>
                 <w:rFonts w:ascii="Consolas" w:hAnsi="Consolas"/>
                 <w:i w:val="0"/>
+                <w:color w:val="000000"/>
                 <w:sz w:val="18"/>
               </w:rPr>
               <w:t>106           e -= (m1 * m2) / ((dx * dx + dy * dy + dz * dz) ** 0.5)</w:t>
@@ -455,7 +533,7 @@
     </w:p>
     <w:tbl>
       <w:tblPr>
-        <w:tblStyle w:val="LightGrid-Accent1"/>
+        <w:tblStyle w:val="TableGrid"/>
         <w:tblW w:type="auto" w:w="0"/>
         <w:tblLook w:firstColumn="1" w:firstRow="1" w:lastColumn="0" w:lastRow="0" w:noHBand="0" w:noVBand="1" w:val="04A0"/>
       </w:tblPr>
@@ -477,6 +555,7 @@
                 <w:rFonts w:ascii="Calibri" w:hAnsi="Calibri"/>
                 <w:b/>
                 <w:i w:val="0"/>
+                <w:color w:val="000000"/>
                 <w:sz w:val="20"/>
               </w:rPr>
               <w:t>Attempt</w:t>
@@ -494,6 +573,7 @@
                 <w:rFonts w:ascii="Calibri" w:hAnsi="Calibri"/>
                 <w:b/>
                 <w:i w:val="0"/>
+                <w:color w:val="000000"/>
                 <w:sz w:val="20"/>
               </w:rPr>
               <w:t>Change</w:t>
@@ -511,6 +591,7 @@
                 <w:rFonts w:ascii="Calibri" w:hAnsi="Calibri"/>
                 <w:b/>
                 <w:i w:val="0"/>
+                <w:color w:val="000000"/>
                 <w:sz w:val="20"/>
               </w:rPr>
               <w:t>Result</w:t>
@@ -528,6 +609,7 @@
                 <w:rFonts w:ascii="Calibri" w:hAnsi="Calibri"/>
                 <w:b/>
                 <w:i w:val="0"/>
+                <w:color w:val="000000"/>
                 <w:sz w:val="20"/>
               </w:rPr>
               <w:t>Verdict</w:t>
@@ -547,6 +629,7 @@
                 <w:rFonts w:ascii="Calibri" w:hAnsi="Calibri"/>
                 <w:b w:val="0"/>
                 <w:i w:val="0"/>
+                <w:color w:val="000000"/>
                 <w:sz w:val="20"/>
               </w:rPr>
               <w:t>1. numpy vectorization</w:t>
@@ -564,6 +647,7 @@
                 <w:rFonts w:ascii="Calibri" w:hAnsi="Calibri"/>
                 <w:b w:val="0"/>
                 <w:i w:val="0"/>
+                <w:color w:val="000000"/>
                 <w:sz w:val="20"/>
               </w:rPr>
               <w:t>Replaced per-body Python lists with numpy arrays, vectorized the pairwise force computation</w:t>
@@ -581,6 +665,7 @@
                 <w:rFonts w:ascii="Calibri" w:hAnsi="Calibri"/>
                 <w:b w:val="0"/>
                 <w:i w:val="0"/>
+                <w:color w:val="000000"/>
                 <w:sz w:val="20"/>
               </w:rPr>
               <w:t>848 ms (75% slower)</w:t>
@@ -598,6 +683,7 @@
                 <w:rFonts w:ascii="Calibri" w:hAnsi="Calibri"/>
                 <w:b w:val="0"/>
                 <w:i w:val="0"/>
+                <w:color w:val="000000"/>
                 <w:sz w:val="20"/>
               </w:rPr>
               <w:t>Regression</w:t>
@@ -617,6 +703,7 @@
                 <w:rFonts w:ascii="Calibri" w:hAnsi="Calibri"/>
                 <w:b w:val="0"/>
                 <w:i w:val="0"/>
+                <w:color w:val="000000"/>
                 <w:sz w:val="20"/>
               </w:rPr>
               <w:t>2. sqrt() instead of **</w:t>
@@ -634,6 +721,7 @@
                 <w:rFonts w:ascii="Calibri" w:hAnsi="Calibri"/>
                 <w:b w:val="0"/>
                 <w:i w:val="0"/>
+                <w:color w:val="000000"/>
                 <w:sz w:val="20"/>
               </w:rPr>
               <w:t>Replaced r2 ** -1.5 and r2 ** 0.5 with a sqrt()-based formula</w:t>
@@ -651,6 +739,7 @@
                 <w:rFonts w:ascii="Calibri" w:hAnsi="Calibri"/>
                 <w:b w:val="0"/>
                 <w:i w:val="0"/>
+                <w:color w:val="000000"/>
                 <w:sz w:val="20"/>
               </w:rPr>
               <w:t>495 ms +/- 2 ms (2.5% slower)</w:t>
@@ -668,6 +757,7 @@
                 <w:rFonts w:ascii="Calibri" w:hAnsi="Calibri"/>
                 <w:b w:val="0"/>
                 <w:i w:val="0"/>
+                <w:color w:val="000000"/>
                 <w:sz w:val="20"/>
               </w:rPr>
               <w:t>Regression</w:t>
@@ -687,6 +777,7 @@
                 <w:rFonts w:ascii="Calibri" w:hAnsi="Calibri"/>
                 <w:b w:val="0"/>
                 <w:i w:val="0"/>
+                <w:color w:val="000000"/>
                 <w:sz w:val="20"/>
               </w:rPr>
               <w:t>3. Flattened index-based iteration</w:t>
@@ -704,6 +795,7 @@
                 <w:rFonts w:ascii="Calibri" w:hAnsi="Calibri"/>
                 <w:b w:val="0"/>
                 <w:i w:val="0"/>
+                <w:color w:val="000000"/>
                 <w:sz w:val="20"/>
               </w:rPr>
               <w:t>Replaced nested-tuple destructuring with integer indices into flat tuples</w:t>
@@ -721,6 +813,7 @@
                 <w:rFonts w:ascii="Calibri" w:hAnsi="Calibri"/>
                 <w:b w:val="0"/>
                 <w:i w:val="0"/>
+                <w:color w:val="000000"/>
                 <w:sz w:val="20"/>
               </w:rPr>
               <w:t>579 ms +/- 2 ms (20% slower)</w:t>
@@ -738,6 +831,7 @@
                 <w:rFonts w:ascii="Calibri" w:hAnsi="Calibri"/>
                 <w:b w:val="0"/>
                 <w:i w:val="0"/>
+                <w:color w:val="000000"/>
                 <w:sz w:val="20"/>
               </w:rPr>
               <w:t>Regression</w:t>
@@ -757,6 +851,7 @@
                 <w:rFonts w:ascii="Calibri" w:hAnsi="Calibri"/>
                 <w:b w:val="0"/>
                 <w:i w:val="0"/>
+                <w:color w:val="000000"/>
                 <w:sz w:val="20"/>
               </w:rPr>
               <w:t>4. Manual loop unrolling</w:t>
@@ -774,6 +869,7 @@
                 <w:rFonts w:ascii="Calibri" w:hAnsi="Calibri"/>
                 <w:b w:val="0"/>
                 <w:i w:val="0"/>
+                <w:color w:val="000000"/>
                 <w:sz w:val="20"/>
               </w:rPr>
               <w:t>Unpacked each body's position once per timestep, wrote out all 10 pairwise force computations and 5 position updates explicitly</w:t>
@@ -791,6 +887,7 @@
                 <w:rFonts w:ascii="Calibri" w:hAnsi="Calibri"/>
                 <w:b w:val="0"/>
                 <w:i w:val="0"/>
+                <w:color w:val="000000"/>
                 <w:sz w:val="20"/>
               </w:rPr>
               <w:t>439 ms +/- 2 ms (9.1% faster)</w:t>
@@ -808,6 +905,7 @@
                 <w:rFonts w:ascii="Calibri" w:hAnsi="Calibri"/>
                 <w:b w:val="0"/>
                 <w:i w:val="0"/>
+                <w:color w:val="000000"/>
                 <w:sz w:val="20"/>
               </w:rPr>
               <w:t>Only attempt to beat baseline</w:t>
@@ -864,7 +962,7 @@
     </w:p>
     <w:tbl>
       <w:tblPr>
-        <w:tblStyle w:val="LightGrid-Accent1"/>
+        <w:tblStyle w:val="TableGrid"/>
         <w:tblW w:type="auto" w:w="0"/>
         <w:tblLook w:firstColumn="1" w:firstRow="1" w:lastColumn="0" w:lastRow="0" w:noHBand="0" w:noVBand="1" w:val="04A0"/>
       </w:tblPr>
@@ -885,6 +983,7 @@
                 <w:rFonts w:ascii="Calibri" w:hAnsi="Calibri"/>
                 <w:b/>
                 <w:i w:val="0"/>
+                <w:color w:val="000000"/>
                 <w:sz w:val="20"/>
               </w:rPr>
               <w:t>Version</w:t>
@@ -902,6 +1001,7 @@
                 <w:rFonts w:ascii="Calibri" w:hAnsi="Calibri"/>
                 <w:b/>
                 <w:i w:val="0"/>
+                <w:color w:val="000000"/>
                 <w:sz w:val="20"/>
               </w:rPr>
               <w:t>Mean +/- std dev</w:t>
@@ -919,6 +1019,7 @@
                 <w:rFonts w:ascii="Calibri" w:hAnsi="Calibri"/>
                 <w:b/>
                 <w:i w:val="0"/>
+                <w:color w:val="000000"/>
                 <w:sz w:val="20"/>
               </w:rPr>
               <w:t>Speedup</w:t>
@@ -938,6 +1039,7 @@
                 <w:rFonts w:ascii="Calibri" w:hAnsi="Calibri"/>
                 <w:b w:val="0"/>
                 <w:i w:val="0"/>
+                <w:color w:val="000000"/>
                 <w:sz w:val="20"/>
               </w:rPr>
               <w:t>Original</w:t>
@@ -955,6 +1057,7 @@
                 <w:rFonts w:ascii="Calibri" w:hAnsi="Calibri"/>
                 <w:b w:val="0"/>
                 <w:i w:val="0"/>
+                <w:color w:val="000000"/>
                 <w:sz w:val="20"/>
               </w:rPr>
               <w:t>483 ms +/- 4 ms</w:t>
@@ -972,6 +1075,7 @@
                 <w:rFonts w:ascii="Calibri" w:hAnsi="Calibri"/>
                 <w:b w:val="0"/>
                 <w:i w:val="0"/>
+                <w:color w:val="000000"/>
                 <w:sz w:val="20"/>
               </w:rPr>
               <w:t>--</w:t>
@@ -991,6 +1095,7 @@
                 <w:rFonts w:ascii="Calibri" w:hAnsi="Calibri"/>
                 <w:b w:val="0"/>
                 <w:i w:val="0"/>
+                <w:color w:val="000000"/>
                 <w:sz w:val="20"/>
               </w:rPr>
               <w:t>Optimized (unroll)</w:t>
@@ -1008,6 +1113,7 @@
                 <w:rFonts w:ascii="Calibri" w:hAnsi="Calibri"/>
                 <w:b w:val="0"/>
                 <w:i w:val="0"/>
+                <w:color w:val="000000"/>
                 <w:sz w:val="20"/>
               </w:rPr>
               <w:t>439 ms +/- 2 ms</w:t>
@@ -1025,6 +1131,7 @@
                 <w:rFonts w:ascii="Calibri" w:hAnsi="Calibri"/>
                 <w:b w:val="0"/>
                 <w:i w:val="0"/>
+                <w:color w:val="000000"/>
                 <w:sz w:val="20"/>
               </w:rPr>
               <w:t>~1.10x (~9.1% faster)</w:t>
@@ -1047,7 +1154,7 @@
     </w:p>
     <w:tbl>
       <w:tblPr>
-        <w:tblStyle w:val="LightGrid-Accent1"/>
+        <w:tblStyle w:val="TableGrid"/>
         <w:tblW w:type="auto" w:w="0"/>
         <w:tblLook w:firstColumn="1" w:firstRow="1" w:lastColumn="0" w:lastRow="0" w:noHBand="0" w:noVBand="1" w:val="04A0"/>
       </w:tblPr>
@@ -1069,6 +1176,7 @@
                 <w:rFonts w:ascii="Calibri" w:hAnsi="Calibri"/>
                 <w:b/>
                 <w:i w:val="0"/>
+                <w:color w:val="000000"/>
                 <w:sz w:val="20"/>
               </w:rPr>
               <w:t>Metric</w:t>
@@ -1086,6 +1194,7 @@
                 <w:rFonts w:ascii="Calibri" w:hAnsi="Calibri"/>
                 <w:b/>
                 <w:i w:val="0"/>
+                <w:color w:val="000000"/>
                 <w:sz w:val="20"/>
               </w:rPr>
               <w:t>Original</w:t>
@@ -1103,6 +1212,7 @@
                 <w:rFonts w:ascii="Calibri" w:hAnsi="Calibri"/>
                 <w:b/>
                 <w:i w:val="0"/>
+                <w:color w:val="000000"/>
                 <w:sz w:val="20"/>
               </w:rPr>
               <w:t>Optimized</w:t>
@@ -1120,6 +1230,7 @@
                 <w:rFonts w:ascii="Calibri" w:hAnsi="Calibri"/>
                 <w:b/>
                 <w:i w:val="0"/>
+                <w:color w:val="000000"/>
                 <w:sz w:val="20"/>
               </w:rPr>
               <w:t>Change</w:t>
@@ -1139,6 +1250,7 @@
                 <w:rFonts w:ascii="Calibri" w:hAnsi="Calibri"/>
                 <w:b w:val="0"/>
                 <w:i w:val="0"/>
+                <w:color w:val="000000"/>
                 <w:sz w:val="20"/>
               </w:rPr>
               <w:t>Instructions</w:t>
@@ -1156,6 +1268,7 @@
                 <w:rFonts w:ascii="Calibri" w:hAnsi="Calibri"/>
                 <w:b w:val="0"/>
                 <w:i w:val="0"/>
+                <w:color w:val="000000"/>
                 <w:sz w:val="20"/>
               </w:rPr>
               <w:t>260,503,357,966</w:t>
@@ -1173,6 +1286,7 @@
                 <w:rFonts w:ascii="Calibri" w:hAnsi="Calibri"/>
                 <w:b w:val="0"/>
                 <w:i w:val="0"/>
+                <w:color w:val="000000"/>
                 <w:sz w:val="20"/>
               </w:rPr>
               <w:t>243,990,614,558</w:t>
@@ -1190,6 +1304,7 @@
                 <w:rFonts w:ascii="Calibri" w:hAnsi="Calibri"/>
                 <w:b w:val="0"/>
                 <w:i w:val="0"/>
+                <w:color w:val="000000"/>
                 <w:sz w:val="20"/>
               </w:rPr>
               <w:t>6.8% fewer</w:t>
@@ -1209,6 +1324,7 @@
                 <w:rFonts w:ascii="Calibri" w:hAnsi="Calibri"/>
                 <w:b w:val="0"/>
                 <w:i w:val="0"/>
+                <w:color w:val="000000"/>
                 <w:sz w:val="20"/>
               </w:rPr>
               <w:t>Cycles</w:t>
@@ -1226,6 +1342,7 @@
                 <w:rFonts w:ascii="Calibri" w:hAnsi="Calibri"/>
                 <w:b w:val="0"/>
                 <w:i w:val="0"/>
+                <w:color w:val="000000"/>
                 <w:sz w:val="20"/>
               </w:rPr>
               <w:t>107,660,144,120</w:t>
@@ -1243,6 +1360,7 @@
                 <w:rFonts w:ascii="Calibri" w:hAnsi="Calibri"/>
                 <w:b w:val="0"/>
                 <w:i w:val="0"/>
+                <w:color w:val="000000"/>
                 <w:sz w:val="20"/>
               </w:rPr>
               <w:t>99,971,763,683</w:t>
@@ -1260,6 +1378,7 @@
                 <w:rFonts w:ascii="Calibri" w:hAnsi="Calibri"/>
                 <w:b w:val="0"/>
                 <w:i w:val="0"/>
+                <w:color w:val="000000"/>
                 <w:sz w:val="20"/>
               </w:rPr>
               <w:t>7.7% fewer</w:t>
@@ -1279,6 +1398,7 @@
                 <w:rFonts w:ascii="Calibri" w:hAnsi="Calibri"/>
                 <w:b w:val="0"/>
                 <w:i w:val="0"/>
+                <w:color w:val="000000"/>
                 <w:sz w:val="20"/>
               </w:rPr>
               <w:t>IPC (insn/cycle)</w:t>
@@ -1296,6 +1416,7 @@
                 <w:rFonts w:ascii="Calibri" w:hAnsi="Calibri"/>
                 <w:b w:val="0"/>
                 <w:i w:val="0"/>
+                <w:color w:val="000000"/>
                 <w:sz w:val="20"/>
               </w:rPr>
               <w:t>2.42</w:t>
@@ -1313,6 +1434,7 @@
                 <w:rFonts w:ascii="Calibri" w:hAnsi="Calibri"/>
                 <w:b w:val="0"/>
                 <w:i w:val="0"/>
+                <w:color w:val="000000"/>
                 <w:sz w:val="20"/>
               </w:rPr>
               <w:t>2.44</w:t>
@@ -1330,6 +1452,7 @@
                 <w:rFonts w:ascii="Calibri" w:hAnsi="Calibri"/>
                 <w:b w:val="0"/>
                 <w:i w:val="0"/>
+                <w:color w:val="000000"/>
                 <w:sz w:val="20"/>
               </w:rPr>
               <w:t>about the same</w:t>
@@ -1349,6 +1472,7 @@
                 <w:rFonts w:ascii="Calibri" w:hAnsi="Calibri"/>
                 <w:b w:val="0"/>
                 <w:i w:val="0"/>
+                <w:color w:val="000000"/>
                 <w:sz w:val="20"/>
               </w:rPr>
               <w:t>Cache-miss rate</w:t>
@@ -1366,6 +1490,7 @@
                 <w:rFonts w:ascii="Calibri" w:hAnsi="Calibri"/>
                 <w:b w:val="0"/>
                 <w:i w:val="0"/>
+                <w:color w:val="000000"/>
                 <w:sz w:val="20"/>
               </w:rPr>
               <w:t>2.83%</w:t>
@@ -1383,6 +1508,7 @@
                 <w:rFonts w:ascii="Calibri" w:hAnsi="Calibri"/>
                 <w:b w:val="0"/>
                 <w:i w:val="0"/>
+                <w:color w:val="000000"/>
                 <w:sz w:val="20"/>
               </w:rPr>
               <w:t>3.25%</w:t>
@@ -1400,6 +1526,7 @@
                 <w:rFonts w:ascii="Calibri" w:hAnsi="Calibri"/>
                 <w:b w:val="0"/>
                 <w:i w:val="0"/>
+                <w:color w:val="000000"/>
                 <w:sz w:val="20"/>
               </w:rPr>
               <w:t>slightly worse</w:t>
@@ -1419,6 +1546,7 @@
                 <w:rFonts w:ascii="Calibri" w:hAnsi="Calibri"/>
                 <w:b w:val="0"/>
                 <w:i w:val="0"/>
+                <w:color w:val="000000"/>
                 <w:sz w:val="20"/>
               </w:rPr>
               <w:t>Branch-miss rate</w:t>
@@ -1436,6 +1564,7 @@
                 <w:rFonts w:ascii="Calibri" w:hAnsi="Calibri"/>
                 <w:b w:val="0"/>
                 <w:i w:val="0"/>
+                <w:color w:val="000000"/>
                 <w:sz w:val="20"/>
               </w:rPr>
               <w:t>0.49%</w:t>
@@ -1453,6 +1582,7 @@
                 <w:rFonts w:ascii="Calibri" w:hAnsi="Calibri"/>
                 <w:b w:val="0"/>
                 <w:i w:val="0"/>
+                <w:color w:val="000000"/>
                 <w:sz w:val="20"/>
               </w:rPr>
               <w:t>0.49%</w:t>
@@ -1470,6 +1600,7 @@
                 <w:rFonts w:ascii="Calibri" w:hAnsi="Calibri"/>
                 <w:b w:val="0"/>
                 <w:i w:val="0"/>
+                <w:color w:val="000000"/>
                 <w:sz w:val="20"/>
               </w:rPr>
               <w:t>unchanged</w:t>

</xml_diff>

<commit_message>
Reconcile nbody hardware proposal: adopt Gravity Force Pipeline
Updates the Claude Docs and report_nbody.docx Hardware Acceleration
Proposal from "Not applicable" to the full Gravity Force Pipeline design
(nbody/HARDWARE.md), so all four artifacts (docs, docx, HARDWARE.md,
report_nbody.txt) tell the same story instead of contradicting each
other. Content ported 1:1 from HARDWARE.md: on-chip 5-body state, 10
parallel force lanes, static accumulate trees, and a sequencer FSM that
runs the entire n-timestep advance() loop without per-timestep CPU round
trips -- plus its block diagram, reused from nbody/hardware/.

Co-Authored-By: Claude Sonnet 5 <noreply@anthropic.com>
</commit_message>
<xml_diff>
--- a/nbody/report_nbody.docx
+++ b/nbody/report_nbody.docx
@@ -1705,7 +1705,320 @@
           <w:i w:val="0"/>
           <w:sz w:val="22"/>
         </w:rPr>
-        <w:t>Not applicable. The project's hardware accelerator design targets pyflate instead -- see that benchmark's report for the full Section 9 proposal.</w:t>
+        <w:t>Targets advance()'s pairwise gravitational-force update (lines 78-97) -- the loop responsible for essentially all of nbody's runtime, and the source of both identified bottlenecks: ~29% self-time in raw interpreter dispatch and ~9.3% self-time boxing/deallocating temporary float objects. Software's best fix (loop unrolling, Attempt 4) only recovered ~9%, since it cannot remove the object-boxing execution model itself, only reduce how often it is paid. That is precisely what dedicated hardware removes entirely.</w:t>
+      </w:r>
+    </w:p>
+    <w:p>
+      <w:pPr>
+        <w:pStyle w:val="Heading3"/>
+      </w:pPr>
+      <w:r>
+        <w:rPr>
+          <w:rFonts w:ascii="Calibri" w:hAnsi="Calibri"/>
+          <w:i w:val="0"/>
+        </w:rPr>
+        <w:t>Hardware description</w:t>
+      </w:r>
+    </w:p>
+    <w:p>
+      <w:r>
+        <w:rPr>
+          <w:rFonts w:ascii="Calibri" w:hAnsi="Calibri"/>
+          <w:b w:val="0"/>
+          <w:i w:val="0"/>
+          <w:sz w:val="22"/>
+        </w:rPr>
+        <w:t>The Gravity Force Pipeline (GFP): a SystemVerilog IP block that holds all 5 bodies' state on-chip and runs the entire advance(dt, n) call -- all n timesteps -- internally, without any per-timestep round trip back to the CPU. This differs from pyflate's accelerator: pyflate's HFDU streams a large, unbounded bitstream through a fixed-latency lookup, where data volume is the challenge. nbody's entire working set is tiny -- 5 bodies times position, velocity, and mass, about 280 bytes -- and stays constant for the whole call. The challenge here is call count: advance() re-enters the same 6-line pairwise computation 200,000+ times per benchmark loop, and every re-entry pays CPython's interpreter dispatch and float-boxing cost. Moving the entire timestep loop onto hardware, not just one pairwise computation, is what removes that cost.</w:t>
+      </w:r>
+    </w:p>
+    <w:p>
+      <w:pPr>
+        <w:pStyle w:val="Heading3"/>
+      </w:pPr>
+      <w:r>
+        <w:rPr>
+          <w:rFonts w:ascii="Calibri" w:hAnsi="Calibri"/>
+          <w:i w:val="0"/>
+        </w:rPr>
+        <w:t>Inputs and outputs</w:t>
+      </w:r>
+    </w:p>
+    <w:p>
+      <w:r>
+        <w:rPr>
+          <w:rFonts w:ascii="Calibri" w:hAnsi="Calibri"/>
+          <w:b w:val="0"/>
+          <w:i w:val="0"/>
+          <w:sz w:val="22"/>
+        </w:rPr>
+        <w:t>Control and status (memory-mapped register file, AXI-Lite style): start, done, n_iterations (32-bit), dt (64-bit IEEE-754 double).</w:t>
+      </w:r>
+    </w:p>
+    <w:p>
+      <w:r>
+        <w:rPr>
+          <w:rFonts w:ascii="Calibri" w:hAnsi="Calibri"/>
+          <w:b w:val="0"/>
+          <w:i w:val="0"/>
+          <w:sz w:val="22"/>
+        </w:rPr>
+        <w:t>State load and readback port: one body-field per cycle -- body index, field select (position/velocity/mass), axis select (x/y/z), write and read data (64-bit). The whole 35-double state loads or reads back in about 35 cycles, negligible next to n_iterations x 10-pair timesteps, so no DMA burst interface is needed.</w:t>
+      </w:r>
+    </w:p>
+    <w:p>
+      <w:r>
+        <w:rPr>
+          <w:rFonts w:ascii="Calibri" w:hAnsi="Calibri"/>
+          <w:b w:val="0"/>
+          <w:i w:val="0"/>
+          <w:sz w:val="22"/>
+        </w:rPr>
+        <w:t>Target frequency: 200-400 MHz for an FPGA prototype, matching pyflate's HFDU estimate.</w:t>
+      </w:r>
+    </w:p>
+    <w:p>
+      <w:pPr>
+        <w:pStyle w:val="Heading3"/>
+      </w:pPr>
+      <w:r>
+        <w:rPr>
+          <w:rFonts w:ascii="Calibri" w:hAnsi="Calibri"/>
+          <w:i w:val="0"/>
+        </w:rPr>
+        <w:t>Hardware architecture</w:t>
+      </w:r>
+    </w:p>
+    <w:p>
+      <w:r>
+        <w:rPr>
+          <w:rFonts w:ascii="Calibri" w:hAnsi="Calibri"/>
+          <w:b w:val="0"/>
+          <w:i w:val="0"/>
+          <w:sz w:val="22"/>
+        </w:rPr>
+        <w:t>Body register file: pos[5][3], vel[5][3], mass[5], all 64-bit IEEE-754 doubles -- matches CPython's float representation exactly.</w:t>
+      </w:r>
+    </w:p>
+    <w:p>
+      <w:r>
+        <w:rPr>
+          <w:rFonts w:ascii="Calibri" w:hAnsi="Calibri"/>
+          <w:b w:val="0"/>
+          <w:i w:val="0"/>
+          <w:sz w:val="22"/>
+        </w:rPr>
+        <w:t>10 parallel Force Lanes: one per body pair, with the pair-to-body-index mapping fixed at synthesis time -- the hardware analogue of the software loop-unrolling optimization, taken to its logical end: 10 lane instances evaluate simultaneously, not sequentially. Each lane computes dx, dy, dz to r-squared to rsqrt-cubed to mag to six velocity-delta terms, matching advance()'s arithmetic exactly. The reciprocal-sqrt-cubed step uses a standard pipelined FP IP core, declared as a black box.</w:t>
+      </w:r>
+    </w:p>
+    <w:p>
+      <w:r>
+        <w:rPr>
+          <w:rFonts w:ascii="Calibri" w:hAnsi="Calibri"/>
+          <w:b w:val="0"/>
+          <w:i w:val="0"/>
+          <w:sz w:val="22"/>
+        </w:rPr>
+        <w:t>Accumulate stage: each body appears in exactly 4 of the 10 pairs, fixed at synthesis time, so this is a static 4-input adder/subtractor tree per body and axis -- 15 trees total, not a dynamic scatter-add.</w:t>
+      </w:r>
+    </w:p>
+    <w:p>
+      <w:r>
+        <w:rPr>
+          <w:rFonts w:ascii="Calibri" w:hAnsi="Calibri"/>
+          <w:b w:val="0"/>
+          <w:i w:val="0"/>
+          <w:sz w:val="22"/>
+        </w:rPr>
+        <w:t>Integrate stage: pos[b][axis] += dt * vel[b][axis] for all 5 bodies, via one multiply and one add per body and axis.</w:t>
+      </w:r>
+    </w:p>
+    <w:p>
+      <w:r>
+        <w:rPr>
+          <w:rFonts w:ascii="Calibri" w:hAnsi="Calibri"/>
+          <w:b w:val="0"/>
+          <w:i w:val="0"/>
+          <w:sz w:val="22"/>
+        </w:rPr>
+        <w:t>Sequencer FSM: IDLE -&gt; LOAD -&gt; FORCE -&gt; ACCUMULATE -&gt; INTEGRATE -&gt; (loop FORCE for n_iterations) -&gt; DONE. The loop back to FORCE happens entirely on-chip -- software is not involved until done asserts.</w:t>
+      </w:r>
+    </w:p>
+    <w:p>
+      <w:pPr>
+        <w:pStyle w:val="Heading3"/>
+      </w:pPr>
+      <w:r>
+        <w:rPr>
+          <w:rFonts w:ascii="Calibri" w:hAnsi="Calibri"/>
+          <w:i w:val="0"/>
+        </w:rPr>
+        <w:t>Hardware/software interface</w:t>
+      </w:r>
+    </w:p>
+    <w:p>
+      <w:r>
+        <w:rPr>
+          <w:rFonts w:ascii="Calibri" w:hAnsi="Calibri"/>
+          <w:b w:val="0"/>
+          <w:i w:val="0"/>
+          <w:sz w:val="22"/>
+        </w:rPr>
+        <w:t>Software's role shrinks to almost nothing per timestep: it writes the initial state and dt/n into the register file, pulses start, polls or is interrupted by done, then reads back the final pos/vel. No DMA channel is needed, since the data volume (280 bytes, once) is trivial. The report_energy() calls that bracket each advance() call stay in software unchanged, since they run far less often and were not the profiled hotspot.</w:t>
+      </w:r>
+    </w:p>
+    <w:p>
+      <w:pPr>
+        <w:pStyle w:val="Heading3"/>
+      </w:pPr>
+      <w:r>
+        <w:rPr>
+          <w:rFonts w:ascii="Calibri" w:hAnsi="Calibri"/>
+          <w:i w:val="0"/>
+        </w:rPr>
+        <w:t>Acceleration justification</w:t>
+      </w:r>
+    </w:p>
+    <w:p>
+      <w:r>
+        <w:rPr>
+          <w:rFonts w:ascii="Calibri" w:hAnsi="Calibri"/>
+          <w:b w:val="0"/>
+          <w:i w:val="0"/>
+          <w:sz w:val="22"/>
+        </w:rPr>
+        <w:t>advance()'s bottleneck is not an inefficient algorithm -- the pairwise loop is already the correct O(pairs) approach, and three of four software attempts to speed it up within CPython made things worse. The cost is structural: every scalar float operation in CPython allocates a heap object, and every iteration re-enters the bytecode interpreter. Neither cost exists in hardware -- computing dx = x1 - x2 is a wire and a subtractor, not a heap allocation. Combined with running all 10 pairs in parallel and keeping the entire n-timestep loop on-chip, this removes both bottlenecks at their root rather than reducing their cost.</w:t>
+      </w:r>
+    </w:p>
+    <w:p>
+      <w:r>
+        <w:rPr>
+          <w:rFonts w:ascii="Calibri" w:hAnsi="Calibri"/>
+          <w:b w:val="0"/>
+          <w:i w:val="0"/>
+          <w:sz w:val="22"/>
+        </w:rPr>
+        <w:t>Estimated improvement: software's own best case (loop unrolling) removed about 9% by cutting redundant interpreter re-entries without touching the underlying per-operation cost. Hardware removes the per-operation cost itself and parallelizes across all 10 pairs, so the realistic ceiling is much higher -- the timestep loop's critical path becomes the force-lane pipeline depth (about 12 cycles, dominated by the FP reciprocal-sqrt-cube unit) plus a small constant for accumulate and integrate, independent of how many times advance() is called. This is an architectural estimate, not a measured one -- no FPGA or ASIC implementation was built or timed.</w:t>
+      </w:r>
+    </w:p>
+    <w:p>
+      <w:pPr>
+        <w:pStyle w:val="Heading3"/>
+      </w:pPr>
+      <w:r>
+        <w:rPr>
+          <w:rFonts w:ascii="Calibri" w:hAnsi="Calibri"/>
+          <w:i w:val="0"/>
+        </w:rPr>
+        <w:t>Block diagram</w:t>
+      </w:r>
+    </w:p>
+    <w:p>
+      <w:pPr>
+        <w:jc w:val="center"/>
+      </w:pPr>
+      <w:r>
+        <w:drawing>
+          <wp:inline xmlns:a="http://schemas.openxmlformats.org/drawingml/2006/main" xmlns:pic="http://schemas.openxmlformats.org/drawingml/2006/picture">
+            <wp:extent cx="5943600" cy="3883043"/>
+            <wp:docPr id="3" name="Picture 3"/>
+            <wp:cNvGraphicFramePr>
+              <a:graphicFrameLocks noChangeAspect="1"/>
+            </wp:cNvGraphicFramePr>
+            <a:graphic>
+              <a:graphicData uri="http://schemas.openxmlformats.org/drawingml/2006/picture">
+                <pic:pic>
+                  <pic:nvPicPr>
+                    <pic:cNvPr id="0" name="block_diagram.png"/>
+                    <pic:cNvPicPr/>
+                  </pic:nvPicPr>
+                  <pic:blipFill>
+                    <a:blip r:embed="rId11"/>
+                    <a:stretch>
+                      <a:fillRect/>
+                    </a:stretch>
+                  </pic:blipFill>
+                  <pic:spPr>
+                    <a:xfrm>
+                      <a:off x="0" y="0"/>
+                      <a:ext cx="5943600" cy="3883043"/>
+                    </a:xfrm>
+                    <a:prstGeom prst="rect"/>
+                  </pic:spPr>
+                </pic:pic>
+              </a:graphicData>
+            </a:graphic>
+          </wp:inline>
+        </w:drawing>
+      </w:r>
+    </w:p>
+    <w:p>
+      <w:pPr>
+        <w:jc w:val="center"/>
+      </w:pPr>
+      <w:r>
+        <w:rPr>
+          <w:rFonts w:ascii="Calibri" w:hAnsi="Calibri"/>
+          <w:b w:val="0"/>
+          <w:i w:val="0"/>
+          <w:sz w:val="20"/>
+        </w:rPr>
+        <w:t>Software (left) loads the 5-body state and pulses start once per advance() call; the GFP (right) runs its register file through the force-lane, accumulate, and integrate chain, looping internally for all n timesteps before asserting done and letting software read back the final state. Compare against pyflate's block diagram, whose software side stays in the loop every block -- the structural difference between the two designs mirrors the structural difference between the two benchmarks' bottlenecks: streaming-data lookup versus call-count/interpreter overhead.</w:t>
+      </w:r>
+    </w:p>
+    <w:p>
+      <w:pPr>
+        <w:pStyle w:val="Heading3"/>
+      </w:pPr>
+      <w:r>
+        <w:rPr>
+          <w:rFonts w:ascii="Calibri" w:hAnsi="Calibri"/>
+          <w:i w:val="0"/>
+        </w:rPr>
+        <w:t>Performance, area, and power trade-offs</w:t>
+      </w:r>
+    </w:p>
+    <w:p>
+      <w:r>
+        <w:rPr>
+          <w:rFonts w:ascii="Calibri" w:hAnsi="Calibri"/>
+          <w:b w:val="0"/>
+          <w:i w:val="0"/>
+          <w:sz w:val="22"/>
+        </w:rPr>
+        <w:t>Performance: critical path is the force-lane pipeline depth, dominated by the FP reciprocal-sqrt-cube unit, amortized across all 10 pairs evaluating in parallel and all n timesteps running without CPU round trips.</w:t>
+      </w:r>
+    </w:p>
+    <w:p>
+      <w:r>
+        <w:rPr>
+          <w:rFonts w:ascii="Calibri" w:hAnsi="Calibri"/>
+          <w:b w:val="0"/>
+          <w:i w:val="0"/>
+          <w:sz w:val="22"/>
+        </w:rPr>
+        <w:t>Area: modest, dominated by the 10 force-lane instances, each containing several 64-bit FP multiply/add/subtract units plus one FP reciprocal-sqrt-cube unit. Ten parallel lanes cost 10x one lane's FP-unit area -- a real trade-off against time-multiplexing fewer FP units across the 10 pairs sequentially. Affordable at this problem size (5 bodies); a larger N-body problem would need to revisit this, since lane count grows as O(bodies squared).</w:t>
+      </w:r>
+    </w:p>
+    <w:p>
+      <w:r>
+        <w:rPr>
+          <w:rFonts w:ascii="Calibri" w:hAnsi="Calibri"/>
+          <w:b w:val="0"/>
+          <w:i w:val="0"/>
+          <w:sz w:val="22"/>
+        </w:rPr>
+        <w:t>Power: dominated by the 10 parallel FP pipelines running every cycle of every timestep -- higher instantaneous power than pyflate's HFDU, but for a much shorter total active time per equivalent unit of work, since there is no interpreter overhead inflating cycle count.</w:t>
+      </w:r>
+    </w:p>
+    <w:p>
+      <w:r>
+        <w:rPr>
+          <w:rFonts w:ascii="Calibri" w:hAnsi="Calibri"/>
+          <w:b w:val="0"/>
+          <w:i w:val="0"/>
+          <w:sz w:val="22"/>
+        </w:rPr>
+        <w:t>Trade-off made explicitly: running all 10 pairs in parallel, rather than time-multiplexing fewer lanes, trades area for eliminating sequencing overhead between pairs -- appropriate here because 10 is small; this would not scale directly to a much larger N-body problem without redesign.</w:t>
       </w:r>
     </w:p>
     <w:p>

</xml_diff>

<commit_message>
Shrink flame graph images to fit within a single page
Flame graphs are portrait (aspect ~0.56) and rendered at ~10.7in tall
at the previous 6in width -- taller than a Letter page. Reduced to 3in
wide (~5.3in tall), leaving room for the heading and caption on the
same page. Block diagrams (landscape, already compact) are unchanged.

Co-Authored-By: Claude Sonnet 5 <noreply@anthropic.com>
</commit_message>
<xml_diff>
--- a/nbody/report_nbody.docx
+++ b/nbody/report_nbody.docx
@@ -462,7 +462,7 @@
       <w:r>
         <w:drawing>
           <wp:inline xmlns:a="http://schemas.openxmlformats.org/drawingml/2006/main" xmlns:pic="http://schemas.openxmlformats.org/drawingml/2006/picture">
-            <wp:extent cx="5486400" cy="9758934"/>
+            <wp:extent cx="2743200" cy="4879467"/>
             <wp:docPr id="1" name="Picture 1"/>
             <wp:cNvGraphicFramePr>
               <a:graphicFrameLocks noChangeAspect="1"/>
@@ -483,7 +483,7 @@
                   <pic:spPr>
                     <a:xfrm>
                       <a:off x="0" y="0"/>
-                      <a:ext cx="5486400" cy="9758934"/>
+                      <a:ext cx="2743200" cy="4879467"/>
                     </a:xfrm>
                     <a:prstGeom prst="rect"/>
                   </pic:spPr>
@@ -1639,7 +1639,7 @@
       <w:r>
         <w:drawing>
           <wp:inline xmlns:a="http://schemas.openxmlformats.org/drawingml/2006/main" xmlns:pic="http://schemas.openxmlformats.org/drawingml/2006/picture">
-            <wp:extent cx="5486400" cy="9758934"/>
+            <wp:extent cx="2743200" cy="4879467"/>
             <wp:docPr id="2" name="Picture 2"/>
             <wp:cNvGraphicFramePr>
               <a:graphicFrameLocks noChangeAspect="1"/>
@@ -1660,7 +1660,7 @@
                   <pic:spPr>
                     <a:xfrm>
                       <a:off x="0" y="0"/>
-                      <a:ext cx="5486400" cy="9758934"/>
+                      <a:ext cx="2743200" cy="4879467"/>
                     </a:xfrm>
                     <a:prstGeom prst="rect"/>
                   </pic:spPr>

</xml_diff>

<commit_message>
Fix stale Conclusion in report_nbody.docx to reference the GFP proposal
The Conclusion still described hardware acceleration as a hypothetical
("requires... dedicated hardware acceleration", "case for a hardware
accelerator") even after the Hardware Acceleration Proposal section above
it was updated with the actual Gravity Force Pipeline design — a leftover
from before that section said "not applicable". Rewords the last two
sentences to reference the completed design instead, matching
report_nbody.txt's conclusion so the two formats stay consistent.

Co-Authored-By: Claude Sonnet 5 <noreply@anthropic.com>
</commit_message>
<xml_diff>
--- a/nbody/report_nbody.docx
+++ b/nbody/report_nbody.docx
@@ -2052,7 +2052,7 @@
           <w:i w:val="0"/>
           <w:sz w:val="22"/>
         </w:rPr>
-        <w:t>The dominant remaining cost -- per-scalar float boxing and deallocation, about 9.3% of self-time -- is structural to CPython's object model for arithmetic. Removing it requires a different execution model entirely, such as a JIT or a C extension, or dedicated hardware acceleration.</w:t>
+        <w:t>The dominant remaining cost -- per-scalar float boxing and deallocation, about 9.3% of self-time -- is structural to CPython's object model for arithmetic. The Gravity Force Pipeline proposed above targets that directly: moving the entire pairwise force computation, accumulation, and position integration into fixed-function hardware, parallelized across all 10 pairs and looped internally for all n timesteps, removes both identified bottlenecks -- interpreter dispatch and float boxing -- at the root rather than reducing how often they're paid, which is the ceiling every software attempt above ran into.</w:t>
       </w:r>
     </w:p>
     <w:p>
@@ -2063,7 +2063,7 @@
           <w:i w:val="0"/>
           <w:sz w:val="22"/>
         </w:rPr>
-        <w:t>Since pyflate already far exceeds the assignment's 7% improvement target on its own, nbody's contribution to this project is this small positive result plus three documented negative ones, and the resulting, well-motivated case for a hardware accelerator.</w:t>
+        <w:t>Between pyflate's ~244x software speedup and nbody's ~9% software speedup plus a complete hardware acceleration design, this project demonstrates both sides of the assignment's goal: software optimization where it works, and a well-justified hardware alternative where CPython's execution model itself is the limiting factor.</w:t>
       </w:r>
     </w:p>
     <w:sectPr>

</xml_diff>